<commit_message>
Cap nhat tu dong Sky-Line ICT Portal (31/10/2026 22:14:35)
</commit_message>
<xml_diff>
--- a/HO_SO_MINH_CHUNG_AI_SPARK_2026/01_Minh_Chung_Tac_Dong_Thuc_Te_Truoc_Sau_AI_Va_Phan_Hoi_GV.docx
+++ b/HO_SO_MINH_CHUNG_AI_SPARK_2026/01_Minh_Chung_Tac_Dong_Thuc_Te_Truoc_Sau_AI_Va_Phan_Hoi_GV.docx
@@ -21,9 +21,13 @@
         </w:tblCellMar>
       </w:tblPr>
       <w:tr>
-        <w:tc>
-          <w:tcPr>
-            <w:tcW w:w="2400" w:type="pct"/>
+        <w:trPr>
+          <w:cantSplit/>
+          <w:tblHeader/>
+        </w:trPr>
+        <w:tc>
+          <w:tcPr>
+            <w:tcW w:w="2500" w:type="pct"/>
             <w:shd w:val="clear" w:color="auto" w:fill="0369A1"/>
           </w:tcPr>
           <w:p>
@@ -40,13 +44,13 @@
                 <w:color w:val="FFFFFF"/>
               </w:rPr>
               <w:t xml:space="preserve">HỆ THỐNG GIÁO DỤC SKY-LINE
-TỔ CHUYÊN MÔN ICT</w:t>
-            </w:r>
-          </w:p>
-        </w:tc>
-        <w:tc>
-          <w:tcPr>
-            <w:tcW w:w="2600" w:type="pct"/>
+ĐƠN VỊ: TỔ ICT</w:t>
+            </w:r>
+          </w:p>
+        </w:tc>
+        <w:tc>
+          <w:tcPr>
+            <w:tcW w:w="2500" w:type="pct"/>
             <w:shd w:val="clear" w:color="auto" w:fill="0369A1"/>
           </w:tcPr>
           <w:p>
@@ -74,7 +78,7 @@
         </w:trPr>
         <w:tc>
           <w:tcPr>
-            <w:tcW w:w="2400" w:type="pct"/>
+            <w:tcW w:w="2500" w:type="pct"/>
             <w:shd w:val="clear" w:color="auto" w:fill="FFFFFF"/>
           </w:tcPr>
           <w:p>
@@ -90,13 +94,13 @@
                 <w:b/>
               </w:rPr>
               <w:t xml:space="preserve">Số: 01-TD/BC-ICT-SKL
-(Hồ sơ dự thi SKY-LINE AI SPARK 2026 - 2027)</w:t>
-            </w:r>
-          </w:p>
-        </w:tc>
-        <w:tc>
-          <w:tcPr>
-            <w:tcW w:w="2600" w:type="pct"/>
+Sản phẩm: Sky-Line ICT Portal - Hệ thống quản trị và vận hành chuyên môn</w:t>
+            </w:r>
+          </w:p>
+        </w:tc>
+        <w:tc>
+          <w:tcPr>
+            <w:tcW w:w="2500" w:type="pct"/>
             <w:shd w:val="clear" w:color="auto" w:fill="FFFFFF"/>
           </w:tcPr>
           <w:p>
@@ -149,7 +153,7 @@
     <w:p>
       <w:pPr>
         <w:jc w:val="center"/>
-        <w:spacing w:before="0" w:after="180" w:line="300" w:lineRule="auto"/>
+        <w:spacing w:before="0" w:after="140" w:line="300" w:lineRule="auto"/>
       </w:pPr>
       <w:r>
         <w:rPr>
@@ -165,17 +169,17 @@
     <w:p>
       <w:pPr>
         <w:jc w:val="center"/>
-        <w:spacing w:before="0" w:after="200" w:line="300" w:lineRule="auto"/>
+        <w:spacing w:before="0" w:after="180" w:line="300" w:lineRule="auto"/>
       </w:pPr>
       <w:r>
         <w:rPr>
           <w:rFonts w:ascii="Times New Roman" w:hAnsi="Times New Roman" w:cs="Times New Roman"/>
           <w:sz w:val="24"/>
           <w:szCs w:val="24"/>
-          <w:i/>
-          <w:color w:val="475569"/>
+          <w:b/>
+          <w:color w:val="0284C7"/>
         </w:rPr>
-        <w:t xml:space="preserve">(Tài liệu minh chứng phục vụ Tiêu chí chấm Vòng 1 &amp; Vòng 2: Tác động thực tế – Trọng số 35%)</w:t>
+        <w:t xml:space="preserve">Tên sản phẩm: Sky-Line ICT Portal - Hệ thống quản trị và vận hành chuyên môn | Tác giả: Thầy Đỗ Anh Huy - Tổ trưởng chuyên môn tổ ICT | Đơn vị: Tổ ICT</w:t>
       </w:r>
     </w:p>
     <w:p>
@@ -191,7 +195,7 @@
           <w:b/>
           <w:color w:val="0369A1"/>
         </w:rPr>
-        <w:t xml:space="preserve">I. QUY MÔ ÁP DỤNG THỰC TẾ TRÊN TOÀN HỆ THỐNG GIÁO DỤC SKY-LINE</w:t>
+        <w:t xml:space="preserve">I. BẢN CHẤT ĐỘT PHÁ “AI KÉP” VÀ QUY MÔ ÁP DỤNG THỰC TẾ TẠI HỆ THỐNG GIÁO DỤC SKY-LINE</w:t>
       </w:r>
     </w:p>
     <w:p>
@@ -205,7 +209,7 @@
           <w:sz w:val="26"/>
           <w:szCs w:val="26"/>
         </w:rPr>
-        <w:t xml:space="preserve">Sản phẩm “Cổng Thông Tin Điều Hành &amp; Hệ Sinh Thái 5 Trợ Lý AI Tổ Chuyên Môn ICT (Sky-Line ICT Portal)” đã được triển khai vận hành thực tế trên toàn Hệ thống Giáo dục Sky-Line với quy mô:</w:t>
+        <w:t xml:space="preserve">Sản phẩm “Sky-Line ICT Portal - Hệ thống quản trị và vận hành chuyên môn” được xây dựng và vận hành theo mô hình “AI Kép (Dual-Layer AI)” tiên phong tại Hệ thống Giáo dục Sky-Line:</w:t>
       </w:r>
     </w:p>
     <w:p>
@@ -219,7 +223,7 @@
           <w:sz w:val="26"/>
           <w:szCs w:val="26"/>
         </w:rPr>
-        <w:t xml:space="preserve">• Phạm vi triển khai: 05 Cơ sở trường học thuộc Hệ thống Giáo dục Sky-Line (Riverside, Central, Hill, Beach, Global).</w:t>
+        <w:t xml:space="preserve">• Tầng 1 – Dùng AI để kiến tạo toàn bộ Hệ thống Quản trị (Vibe Coding trên nền tảng Google Antigravity IDE): Thay vì phụ thuộc vào công ty phần mềm bên ngoài, Tác giả (Thầy Đỗ Anh Huy) đã ứng dụng phương pháp Vibe Coding trên Google Antigravity IDE kết hợp bộ Hiến pháp điều khiển AI (AGENTS.md), 04 bộ Kỹ năng chuyên sâu (.agents/skills/) và giao thức MCP (Supabase, GitHub) để AI tự động xây dựng trọn vẹn 07 Phân hệ quản trị web cùng 13 bảng Cơ sở dữ liệu đám mây có khóa bảo mật RLS.</w:t>
       </w:r>
     </w:p>
     <w:p>
@@ -233,21 +237,7 @@
           <w:sz w:val="26"/>
           <w:szCs w:val="26"/>
         </w:rPr>
-        <w:t xml:space="preserve">• Hạ tầng quản lý trực tiếp: 06 Phòng Lab Tin học &amp; Robotics chuyên dụng, phục vụ 113 lớp học (Tiểu học, THCS, THPT) với hơn 152 tiết thực hành/tuần.</w:t>
-      </w:r>
-    </w:p>
-    <w:p>
-      <w:pPr>
-        <w:jc w:val="both"/>
-        <w:spacing w:before="0" w:after="120" w:line="300" w:lineRule="auto"/>
-      </w:pPr>
-      <w:r>
-        <w:rPr>
-          <w:rFonts w:ascii="Times New Roman" w:hAnsi="Times New Roman" w:cs="Times New Roman"/>
-          <w:sz w:val="26"/>
-          <w:szCs w:val="26"/>
-        </w:rPr>
-        <w:t xml:space="preserve">• Đội ngũ thụ hưởng trực tiếp: Tổ trưởng Chuyên môn ICT và toàn bộ 07 Giáo viên Tin học – Robotics liên cấp.</w:t>
+        <w:t xml:space="preserve">• Tầng 2 – Tích hợp 05 Trợ lý AI vận hành trực tiếp bên trong hệ thống: Tự động hóa việc kiểm tra chống trùng lịch 6 phòng Lab, tư vấn lộ trình năng lực IDP 360°, cố vấn xử lý sự vụ phòng máy, điểm tin công nghệ 08h00 sáng Thứ Bảy và soạn thảo Kế hoạch/Tờ trình/Email điều hành từ số liệu thật.</w:t>
       </w:r>
     </w:p>
     <w:p>
@@ -262,7 +252,7 @@
           <w:szCs w:val="26"/>
           <w:b/>
         </w:rPr>
-        <w:t xml:space="preserve">• Chi phí vận hành phần mềm &amp; AI: 0 đồng/tháng (Tự chủ 100% mã nguồn trên nền tảng Next.js, Vercel và Cơ sở dữ liệu Supabase có khóa bảo mật phân quyền RLS).</w:t>
+        <w:t xml:space="preserve">• Quy mô triển khai thực tế: Vận hành đồng bộ trên cả 05 Cơ sở Sky-Line (Riverside, Central, Hill, Beach, Global), quản lý 06 Phòng Lab, 113 lớp học (Tiểu học, THCS, THPT), 152 tiết thực hành/tuần và 100% giáo viên Tổ ICT sử dụng hằng ngày với chi phí vận hành 0 đồng/tháng.</w:t>
       </w:r>
     </w:p>
     <w:p>
@@ -278,7 +268,7 @@
           <w:b/>
           <w:color w:val="0369A1"/>
         </w:rPr>
-        <w:t xml:space="preserve">II. BẢNG ĐỐI SÁNH ĐỊNH LƯỢNG HIỆU QUẢ TRƯỚC VÀ SAU KHI ÁP DỤNG HỆ SINH THÁI 5 TRỢ LÝ AI</w:t>
+        <w:t xml:space="preserve">II. BẢNG ĐỐI SÁNH ĐỊNH LƯỢNG HIỆU QUẢ TRƯỚC VÀ SAU KHI TRIỂN KHAI HỆ THỐNG</w:t>
       </w:r>
     </w:p>
     <w:tbl>
@@ -300,6 +290,10 @@
         </w:tblCellMar>
       </w:tblPr>
       <w:tr>
+        <w:trPr>
+          <w:cantSplit/>
+          <w:tblHeader/>
+        </w:trPr>
         <w:tc>
           <w:tcPr>
             <w:tcW w:w="1100" w:type="pct"/>
@@ -318,13 +312,13 @@
                 <w:b/>
                 <w:color w:val="FFFFFF"/>
               </w:rPr>
-              <w:t xml:space="preserve">Hạng mục Nghiệp vụ tại Tổ ICT</w:t>
-            </w:r>
-          </w:p>
-        </w:tc>
-        <w:tc>
-          <w:tcPr>
-            <w:tcW w:w="1300" w:type="pct"/>
+              <w:t xml:space="preserve">Hạng mục Quản trị &amp; Vận hành Chuyên môn</w:t>
+            </w:r>
+          </w:p>
+        </w:tc>
+        <w:tc>
+          <w:tcPr>
+            <w:tcW w:w="1250" w:type="pct"/>
             <w:shd w:val="clear" w:color="auto" w:fill="0369A1"/>
           </w:tcPr>
           <w:p>
@@ -340,14 +334,14 @@
                 <w:b/>
                 <w:color w:val="FFFFFF"/>
               </w:rPr>
-              <w:t xml:space="preserve">Trước khi có AI
+              <w:t xml:space="preserve">Trước khi có sản phẩm
 (Làm thủ công trên Excel / Zalo / Word)</w:t>
             </w:r>
           </w:p>
         </w:tc>
         <w:tc>
           <w:tcPr>
-            <w:tcW w:w="1400" w:type="pct"/>
+            <w:tcW w:w="1450" w:type="pct"/>
             <w:shd w:val="clear" w:color="auto" w:fill="0369A1"/>
           </w:tcPr>
           <w:p>
@@ -363,7 +357,8 @@
                 <w:b/>
                 <w:color w:val="FFFFFF"/>
               </w:rPr>
-              <w:t xml:space="preserve">Sau khi áp dụng Hệ sinh thái 5 Trợ lý AI Sky-Line ICT Portal</w:t>
+              <w:t xml:space="preserve">Sau khi áp dụng Sky-Line ICT Portal
+(Vibe Coding trên Google Antigravity IDE + 5 Trợ lý AI)</w:t>
             </w:r>
           </w:p>
         </w:tc>
@@ -411,47 +406,47 @@
                 <w:szCs w:val="24"/>
                 <w:b/>
               </w:rPr>
-              <w:t xml:space="preserve">1. Xếp Thời khóa biểu &amp; Điều phối 6 Phòng Lab chống trùng (AI Số 1)</w:t>
-            </w:r>
-          </w:p>
-        </w:tc>
-        <w:tc>
-          <w:tcPr>
-            <w:tcW w:w="1300" w:type="pct"/>
-            <w:shd w:val="clear" w:color="auto" w:fill="FFFFFF"/>
-          </w:tcPr>
-          <w:p>
-            <w:pPr>
-              <w:jc w:val="left"/>
-              <w:spacing w:before="40" w:after="40" w:line="300" w:lineRule="auto"/>
-            </w:pPr>
-            <w:r>
-              <w:rPr>
-                <w:rFonts w:ascii="Times New Roman" w:hAnsi="Times New Roman" w:cs="Times New Roman"/>
-                <w:sz w:val="24"/>
-                <w:szCs w:val="24"/>
-              </w:rPr>
-              <w:t xml:space="preserve">Mất 3–4 giờ/tuần dò thủ công trên nhiều file Excel rời rạc giữa 5 cơ sở; dễ xảy ra trùng lịch phòng Lab khi giáo viên đổi tiết hoặc dạy bù đột xuất.</w:t>
-            </w:r>
-          </w:p>
-        </w:tc>
-        <w:tc>
-          <w:tcPr>
-            <w:tcW w:w="1400" w:type="pct"/>
-            <w:shd w:val="clear" w:color="auto" w:fill="FFFFFF"/>
-          </w:tcPr>
-          <w:p>
-            <w:pPr>
-              <w:jc w:val="left"/>
-              <w:spacing w:before="40" w:after="40" w:line="300" w:lineRule="auto"/>
-            </w:pPr>
-            <w:r>
-              <w:rPr>
-                <w:rFonts w:ascii="Times New Roman" w:hAnsi="Times New Roman" w:cs="Times New Roman"/>
-                <w:sz w:val="24"/>
-                <w:szCs w:val="24"/>
-              </w:rPr>
-              <w:t xml:space="preserve">Trợ lý AI Số 1 tự động quét 100% tiết dạy thực tế trên CSDL, phát hiện xung đột tức thì, tính chỉ số cân bằng tải giáo viên và gợi ý khung tiết trống vàng của từng Phòng Lab trong 30 giây.</w:t>
+              <w:t xml:space="preserve">0. Xây dựng Hệ thống Phần mềm Quản trị chuyên biệt cho Tổ bộ môn</w:t>
+            </w:r>
+          </w:p>
+        </w:tc>
+        <w:tc>
+          <w:tcPr>
+            <w:tcW w:w="1250" w:type="pct"/>
+            <w:shd w:val="clear" w:color="auto" w:fill="FFFFFF"/>
+          </w:tcPr>
+          <w:p>
+            <w:pPr>
+              <w:jc w:val="left"/>
+              <w:spacing w:before="40" w:after="40" w:line="300" w:lineRule="auto"/>
+            </w:pPr>
+            <w:r>
+              <w:rPr>
+                <w:rFonts w:ascii="Times New Roman" w:hAnsi="Times New Roman" w:cs="Times New Roman"/>
+                <w:sz w:val="24"/>
+                <w:szCs w:val="24"/>
+              </w:rPr>
+              <w:t xml:space="preserve">Cách cũ KHÔNG LÀM ĐƯỢC: Muốn có phần mềm quản trị riêng cho 5 cơ sở phải thuê công ty lập trình tốn hàng chục triệu đồng và mất nhiều tháng phát triển.</w:t>
+            </w:r>
+          </w:p>
+        </w:tc>
+        <w:tc>
+          <w:tcPr>
+            <w:tcW w:w="1450" w:type="pct"/>
+            <w:shd w:val="clear" w:color="auto" w:fill="FFFFFF"/>
+          </w:tcPr>
+          <w:p>
+            <w:pPr>
+              <w:jc w:val="left"/>
+              <w:spacing w:before="40" w:after="40" w:line="300" w:lineRule="auto"/>
+            </w:pPr>
+            <w:r>
+              <w:rPr>
+                <w:rFonts w:ascii="Times New Roman" w:hAnsi="Times New Roman" w:cs="Times New Roman"/>
+                <w:sz w:val="24"/>
+                <w:szCs w:val="24"/>
+              </w:rPr>
+              <w:t xml:space="preserve">Tổ trưởng trực tiếp dùng Vibe Coding trên Google Antigravity IDE kiến tạo toàn bộ 7 phân hệ web &amp; 13 bảng CSDL đám mây chỉ bằng ngôn ngữ tự nhiên và bộ quy tắc nghiệp vụ.</w:t>
             </w:r>
           </w:p>
         </w:tc>
@@ -471,8 +466,8 @@
                 <w:sz w:val="24"/>
                 <w:szCs w:val="24"/>
               </w:rPr>
-              <w:t xml:space="preserve">• Giảm 98% thời gian rà soát lịch.
-• Đạt 0% xung đột trùng phòng Lab &amp; trùng giáo viên.</w:t>
+              <w:t xml:space="preserve">• Giải quyết việc cách cũ không làm được.
+• Tiết kiệm 100% chi phí thuê viết phần mềm (0 đồng).</w:t>
             </w:r>
           </w:p>
         </w:tc>
@@ -498,13 +493,13 @@
                 <w:szCs w:val="24"/>
                 <w:b/>
               </w:rPr>
-              <w:t xml:space="preserve">2. Đánh giá Năng lực Giáo viên 360° (15 tiêu chí) &amp; Tư vấn Lộ trình IDP (AI Số 2)</w:t>
-            </w:r>
-          </w:p>
-        </w:tc>
-        <w:tc>
-          <w:tcPr>
-            <w:tcW w:w="1300" w:type="pct"/>
+              <w:t xml:space="preserve">1. Xếp Thời khóa biểu &amp; Điều phối 6 Phòng Lab chống trùng (AI Số 1)</w:t>
+            </w:r>
+          </w:p>
+        </w:tc>
+        <w:tc>
+          <w:tcPr>
+            <w:tcW w:w="1250" w:type="pct"/>
             <w:shd w:val="clear" w:color="auto" w:fill="F8FAFC"/>
           </w:tcPr>
           <w:p>
@@ -518,13 +513,13 @@
                 <w:sz w:val="24"/>
                 <w:szCs w:val="24"/>
               </w:rPr>
-              <w:t xml:space="preserve">Mất 2–3 ngày mỗi kỳ để tổng hợp phiếu đánh giá; nội dung tư vấn lộ trình phát triển cá nhân (IDP) thường chung chung, thiếu đối chiếu với khối lượng công việc thực tế.</w:t>
-            </w:r>
-          </w:p>
-        </w:tc>
-        <w:tc>
-          <w:tcPr>
-            <w:tcW w:w="1400" w:type="pct"/>
+              <w:t xml:space="preserve">Mất 3–4 giờ/tuần dò thủ công trên nhiều file Excel rời rạc giữa 5 cơ sở; dễ xảy ra trùng lịch phòng Lab khi giáo viên đổi tiết hoặc dạy bù đột xuất.</w:t>
+            </w:r>
+          </w:p>
+        </w:tc>
+        <w:tc>
+          <w:tcPr>
+            <w:tcW w:w="1450" w:type="pct"/>
             <w:shd w:val="clear" w:color="auto" w:fill="F8FAFC"/>
           </w:tcPr>
           <w:p>
@@ -538,7 +533,7 @@
                 <w:sz w:val="24"/>
                 <w:szCs w:val="24"/>
               </w:rPr>
-              <w:t xml:space="preserve">Trợ lý AI Số 2 truy xuất chéo 5 bảng Database (Điểm 15 tiêu chí, 24 kịch bản huấn luyện, Công việc được giao, Sự vụ đã xử lý, Đội tuyển bồi dưỡng) để lập lộ trình IDP 3 giai đoạn trong 5 giây.</w:t>
+              <w:t xml:space="preserve">Hệ thống quản lý tập trung 152 tiết/tuần; Trợ lý AI Số 1 tự động quét xung đột, tính cân bằng tải giáo viên và gợi ý khung tiết trống vàng của từng Phòng Lab trong 30 giây.</w:t>
             </w:r>
           </w:p>
         </w:tc>
@@ -558,8 +553,8 @@
                 <w:sz w:val="24"/>
                 <w:szCs w:val="24"/>
               </w:rPr>
-              <w:t xml:space="preserve">• Tiết kiệm 95% thời gian tổng hợp.
-• Cá nhân hóa 100% theo cấp học (IC3 Spark, IC3 GS6, MOS, Scratch, Python, Whalesbot).</w:t>
+              <w:t xml:space="preserve">• Giảm 98% thời gian rà soát lịch.
+• Đạt 0% xung đột trùng phòng Lab &amp; trùng giáo viên.</w:t>
             </w:r>
           </w:p>
         </w:tc>
@@ -585,47 +580,47 @@
                 <w:szCs w:val="24"/>
                 <w:b/>
               </w:rPr>
-              <w:t xml:space="preserve">3. Tiếp nhận &amp; Chỉ đạo Xử lý Sự vụ Phòng Lab (AI Số 3)</w:t>
-            </w:r>
-          </w:p>
-        </w:tc>
-        <w:tc>
-          <w:tcPr>
-            <w:tcW w:w="1300" w:type="pct"/>
-            <w:shd w:val="clear" w:color="auto" w:fill="FFFFFF"/>
-          </w:tcPr>
-          <w:p>
-            <w:pPr>
-              <w:jc w:val="left"/>
-              <w:spacing w:before="40" w:after="40" w:line="300" w:lineRule="auto"/>
-            </w:pPr>
-            <w:r>
-              <w:rPr>
-                <w:rFonts w:ascii="Times New Roman" w:hAnsi="Times New Roman" w:cs="Times New Roman"/>
-                <w:sz w:val="24"/>
-                <w:szCs w:val="24"/>
-              </w:rPr>
-              <w:t xml:space="preserve">Báo cáo sự cố qua tin nhắn Zalo dễ bị trôi, thiếu quy trình xử lý chuẩn và rất khó tra cứu lại lịch sử minh chứng khắc phục cuối năm.</w:t>
-            </w:r>
-          </w:p>
-        </w:tc>
-        <w:tc>
-          <w:tcPr>
-            <w:tcW w:w="1400" w:type="pct"/>
-            <w:shd w:val="clear" w:color="auto" w:fill="FFFFFF"/>
-          </w:tcPr>
-          <w:p>
-            <w:pPr>
-              <w:jc w:val="left"/>
-              <w:spacing w:before="40" w:after="40" w:line="300" w:lineRule="auto"/>
-            </w:pPr>
-            <w:r>
-              <w:rPr>
-                <w:rFonts w:ascii="Times New Roman" w:hAnsi="Times New Roman" w:cs="Times New Roman"/>
-                <w:sz w:val="24"/>
-                <w:szCs w:val="24"/>
-              </w:rPr>
-              <w:t xml:space="preserve">Trợ lý AI Số 3 phân tích sự vụ theo 6 nhóm chuyên môn, tự động gợi ý quy trình xử lý 3 bước (Tức thời – Phối hợp – Phòng ngừa chuẩn SLA) và dự thảo ý kiến chỉ đạo cho Tổ trưởng.</w:t>
+              <w:t xml:space="preserve">2. Đánh giá Năng lực Giáo viên 360° (15 tiêu chí) &amp; Tư vấn Lộ trình IDP (AI Số 2)</w:t>
+            </w:r>
+          </w:p>
+        </w:tc>
+        <w:tc>
+          <w:tcPr>
+            <w:tcW w:w="1250" w:type="pct"/>
+            <w:shd w:val="clear" w:color="auto" w:fill="FFFFFF"/>
+          </w:tcPr>
+          <w:p>
+            <w:pPr>
+              <w:jc w:val="left"/>
+              <w:spacing w:before="40" w:after="40" w:line="300" w:lineRule="auto"/>
+            </w:pPr>
+            <w:r>
+              <w:rPr>
+                <w:rFonts w:ascii="Times New Roman" w:hAnsi="Times New Roman" w:cs="Times New Roman"/>
+                <w:sz w:val="24"/>
+                <w:szCs w:val="24"/>
+              </w:rPr>
+              <w:t xml:space="preserve">Mất 2–3 ngày mỗi kỳ để tổng hợp phiếu đánh giá; nội dung tư vấn lộ trình phát triển cá nhân (IDP) thường chung chung, thiếu đối chiếu đa chiều.</w:t>
+            </w:r>
+          </w:p>
+        </w:tc>
+        <w:tc>
+          <w:tcPr>
+            <w:tcW w:w="1450" w:type="pct"/>
+            <w:shd w:val="clear" w:color="auto" w:fill="FFFFFF"/>
+          </w:tcPr>
+          <w:p>
+            <w:pPr>
+              <w:jc w:val="left"/>
+              <w:spacing w:before="40" w:after="40" w:line="300" w:lineRule="auto"/>
+            </w:pPr>
+            <w:r>
+              <w:rPr>
+                <w:rFonts w:ascii="Times New Roman" w:hAnsi="Times New Roman" w:cs="Times New Roman"/>
+                <w:sz w:val="24"/>
+                <w:szCs w:val="24"/>
+              </w:rPr>
+              <w:t xml:space="preserve">Trợ lý AI Số 2 truy xuất chéo 5 bảng Database (Điểm 15 tiêu chí, 24 kịch bản huấn luyện, Công việc, Sự vụ, Đội tuyển) để lập lộ trình IDP 3 giai đoạn trong 5 giây.</w:t>
             </w:r>
           </w:p>
         </w:tc>
@@ -645,8 +640,8 @@
                 <w:sz w:val="24"/>
                 <w:szCs w:val="24"/>
               </w:rPr>
-              <w:t xml:space="preserve">• Rút ngắn 80% thời gian phản hồi sự cố phòng máy.
-• Lưu vết minh chứng xử lý đạt 100%.</w:t>
+              <w:t xml:space="preserve">• Tiết kiệm 95% thời gian tổng hợp.
+• Cá nhân hóa 100% theo cấp học (IC3 Spark, IC3 GS6, MOS, Scratch, Python, Whalesbot).</w:t>
             </w:r>
           </w:p>
         </w:tc>
@@ -672,13 +667,13 @@
                 <w:szCs w:val="24"/>
                 <w:b/>
               </w:rPr>
-              <w:t xml:space="preserve">4. Điểm tin Công nghệ 08h00 Thứ Bảy &amp; Cập nhật Chương trình ICT (AI Số 4)</w:t>
-            </w:r>
-          </w:p>
-        </w:tc>
-        <w:tc>
-          <w:tcPr>
-            <w:tcW w:w="1300" w:type="pct"/>
+              <w:t xml:space="preserve">3. Kiểm kê Thiết bị Robot &amp; Xử lý Sự vụ Phòng Lab (AI Số 3)</w:t>
+            </w:r>
+          </w:p>
+        </w:tc>
+        <w:tc>
+          <w:tcPr>
+            <w:tcW w:w="1250" w:type="pct"/>
             <w:shd w:val="clear" w:color="auto" w:fill="F8FAFC"/>
           </w:tcPr>
           <w:p>
@@ -692,13 +687,13 @@
                 <w:sz w:val="24"/>
                 <w:szCs w:val="24"/>
               </w:rPr>
-              <w:t xml:space="preserve">Tổ trưởng phải tự tìm đọc rời rạc trên nhiều trang báo; việc chuyển hóa xu hướng công nghệ mới thành nhiệm vụ chuyên môn thường bị chậm nhịp.</w:t>
-            </w:r>
-          </w:p>
-        </w:tc>
-        <w:tc>
-          <w:tcPr>
-            <w:tcW w:w="1400" w:type="pct"/>
+              <w:t xml:space="preserve">Báo hỏng thiết bị hoặc sự cố qua tin nhắn Zalo dễ bị trôi, thiếu quy trình xử lý chuẩn và rất khó tra cứu lại lịch sử minh chứng khắc phục cuối năm.</w:t>
+            </w:r>
+          </w:p>
+        </w:tc>
+        <w:tc>
+          <w:tcPr>
+            <w:tcW w:w="1450" w:type="pct"/>
             <w:shd w:val="clear" w:color="auto" w:fill="F8FAFC"/>
           </w:tcPr>
           <w:p>
@@ -712,7 +707,7 @@
                 <w:sz w:val="24"/>
                 <w:szCs w:val="24"/>
               </w:rPr>
-              <w:t xml:space="preserve">Trợ lý AI Số 4 tự động quét nguồn tin chính thống Cấp 1 + Tìm kiếm mở toàn mạng lúc 08h00 sáng Thứ Bảy, tham mưu cập nhật chương trình 3 cấp học và chuyển thẳng thành công việc giao giáo viên chỉ với 1 cú nhấp chuột.</w:t>
+              <w:t xml:space="preserve">Báo hỏng thiết bị 1 chạm theo 5 cơ sở; Trợ lý AI Số 3 tự động gợi ý quy trình xử lý sự vụ 3 bước (Tức thời – Phối hợp – Phòng ngừa SLA) và dự thảo chỉ đạo.</w:t>
             </w:r>
           </w:p>
         </w:tc>
@@ -732,8 +727,8 @@
                 <w:sz w:val="24"/>
                 <w:szCs w:val="24"/>
               </w:rPr>
-              <w:t xml:space="preserve">• Tiết kiệm ~2 giờ/tuần đọc &amp; tổng hợp tin tức.
-• Chủ động cập nhật xu hướng AI, STEM Robotics hàng tuần.</w:t>
+              <w:t xml:space="preserve">• Rút ngắn 80% thời gian phản hồi sự cố phòng máy.
+• Lưu vết minh chứng xử lý đạt 100%.</w:t>
             </w:r>
           </w:p>
         </w:tc>
@@ -759,14 +754,101 @@
                 <w:szCs w:val="24"/>
                 <w:b/>
               </w:rPr>
+              <w:t xml:space="preserve">4. Điểm tin Công nghệ 08h00 Thứ Bảy &amp; Cập nhật Chương trình ICT (AI Số 4)</w:t>
+            </w:r>
+          </w:p>
+        </w:tc>
+        <w:tc>
+          <w:tcPr>
+            <w:tcW w:w="1250" w:type="pct"/>
+            <w:shd w:val="clear" w:color="auto" w:fill="FFFFFF"/>
+          </w:tcPr>
+          <w:p>
+            <w:pPr>
+              <w:jc w:val="left"/>
+              <w:spacing w:before="40" w:after="40" w:line="300" w:lineRule="auto"/>
+            </w:pPr>
+            <w:r>
+              <w:rPr>
+                <w:rFonts w:ascii="Times New Roman" w:hAnsi="Times New Roman" w:cs="Times New Roman"/>
+                <w:sz w:val="24"/>
+                <w:szCs w:val="24"/>
+              </w:rPr>
+              <w:t xml:space="preserve">Tổ trưởng phải tự tìm đọc rời rạc trên nhiều trang báo; việc chuyển hóa xu hướng công nghệ mới thành nhiệm vụ chuyên môn thường bị chậm nhịp.</w:t>
+            </w:r>
+          </w:p>
+        </w:tc>
+        <w:tc>
+          <w:tcPr>
+            <w:tcW w:w="1450" w:type="pct"/>
+            <w:shd w:val="clear" w:color="auto" w:fill="FFFFFF"/>
+          </w:tcPr>
+          <w:p>
+            <w:pPr>
+              <w:jc w:val="left"/>
+              <w:spacing w:before="40" w:after="40" w:line="300" w:lineRule="auto"/>
+            </w:pPr>
+            <w:r>
+              <w:rPr>
+                <w:rFonts w:ascii="Times New Roman" w:hAnsi="Times New Roman" w:cs="Times New Roman"/>
+                <w:sz w:val="24"/>
+                <w:szCs w:val="24"/>
+              </w:rPr>
+              <w:t xml:space="preserve">Trợ lý AI Số 4 tự động quét nguồn tin chính thống Cấp 1 + Tìm kiếm mở lúc 08h00 sáng Thứ Bảy, tham mưu cập nhật chương trình 3 cấp học và giao việc cho giáo viên 1 chạm.</w:t>
+            </w:r>
+          </w:p>
+        </w:tc>
+        <w:tc>
+          <w:tcPr>
+            <w:tcW w:w="1200" w:type="pct"/>
+            <w:shd w:val="clear" w:color="auto" w:fill="FFFFFF"/>
+          </w:tcPr>
+          <w:p>
+            <w:pPr>
+              <w:jc w:val="left"/>
+              <w:spacing w:before="40" w:after="40" w:line="300" w:lineRule="auto"/>
+            </w:pPr>
+            <w:r>
+              <w:rPr>
+                <w:rFonts w:ascii="Times New Roman" w:hAnsi="Times New Roman" w:cs="Times New Roman"/>
+                <w:sz w:val="24"/>
+                <w:szCs w:val="24"/>
+              </w:rPr>
+              <w:t xml:space="preserve">• Tiết kiệm ~2 giờ/tuần đọc &amp; tổng hợp tin tức.
+• Chủ động cập nhật xu hướng AI, STEM Robotics hàng tuần.</w:t>
+            </w:r>
+          </w:p>
+        </w:tc>
+      </w:tr>
+      <w:tr>
+        <w:trPr>
+          <w:cantSplit/>
+        </w:trPr>
+        <w:tc>
+          <w:tcPr>
+            <w:tcW w:w="1100" w:type="pct"/>
+            <w:shd w:val="clear" w:color="auto" w:fill="F8FAFC"/>
+          </w:tcPr>
+          <w:p>
+            <w:pPr>
+              <w:jc w:val="left"/>
+              <w:spacing w:before="40" w:after="40" w:line="300" w:lineRule="auto"/>
+            </w:pPr>
+            <w:r>
+              <w:rPr>
+                <w:rFonts w:ascii="Times New Roman" w:hAnsi="Times New Roman" w:cs="Times New Roman"/>
+                <w:sz w:val="24"/>
+                <w:szCs w:val="24"/>
+                <w:b/>
+              </w:rPr>
               <w:t xml:space="preserve">5. Soạn thảo Kế hoạch, Tờ trình, Biên bản &amp; Email Điều hành (AI Số 5)</w:t>
             </w:r>
           </w:p>
         </w:tc>
         <w:tc>
           <w:tcPr>
-            <w:tcW w:w="1300" w:type="pct"/>
-            <w:shd w:val="clear" w:color="auto" w:fill="FFFFFF"/>
+            <w:tcW w:w="1250" w:type="pct"/>
+            <w:shd w:val="clear" w:color="auto" w:fill="F8FAFC"/>
           </w:tcPr>
           <w:p>
             <w:pPr>
@@ -785,8 +867,8 @@
         </w:tc>
         <w:tc>
           <w:tcPr>
-            <w:tcW w:w="1400" w:type="pct"/>
-            <w:shd w:val="clear" w:color="auto" w:fill="FFFFFF"/>
+            <w:tcW w:w="1450" w:type="pct"/>
+            <w:shd w:val="clear" w:color="auto" w:fill="F8FAFC"/>
           </w:tcPr>
           <w:p>
             <w:pPr>
@@ -806,7 +888,7 @@
         <w:tc>
           <w:tcPr>
             <w:tcW w:w="1200" w:type="pct"/>
-            <w:shd w:val="clear" w:color="auto" w:fill="FFFFFF"/>
+            <w:shd w:val="clear" w:color="auto" w:fill="F8FAFC"/>
           </w:tcPr>
           <w:p>
             <w:pPr>
@@ -852,7 +934,7 @@
           <w:b/>
           <w:color w:val="0369A1"/>
         </w:rPr>
-        <w:t xml:space="preserve">III. GHI NHẬN PHẢN HỒI THỰC TẾ TỪ ĐỘI NGŨ GIÁO VIÊN TRONG TỔ CHUYÊN MÔN ICT</w:t>
+        <w:t xml:space="preserve">III. GHI NHẬN PHẢN HỒI THỰC TẾ TỪ ĐỘI NGŨ GIÁO VIÊN TRONG TỔ ICT</w:t>
       </w:r>
     </w:p>
     <w:tbl>
@@ -874,6 +956,10 @@
         </w:tblCellMar>
       </w:tblPr>
       <w:tr>
+        <w:trPr>
+          <w:cantSplit/>
+          <w:tblHeader/>
+        </w:trPr>
         <w:tc>
           <w:tcPr>
             <w:tcW w:w="1100" w:type="pct"/>
@@ -1003,7 +1089,7 @@
                 <w:sz w:val="24"/>
                 <w:szCs w:val="24"/>
               </w:rPr>
-              <w:t xml:space="preserve">“Khi phòng máy phát sinh sự cố kỹ thuật hoặc cần phương án phân hóa bài tập thực hành, Trợ lý AI Sự vụ gợi ý ngay 3 bước xử lý rất sát thực tế phòng Lab, giúp tiết học không bị gián đoạn và lưu lại minh chứng rất rõ ràng.”</w:t>
+              <w:t xml:space="preserve">“Hệ thống giúp tôi theo dõi toàn bộ lịch phòng Lab, đầu việc Tổ trưởng giao và báo cáo tình trạng thiết bị ngay trên một màn hình duy nhất. Khi phát sinh sự cố phòng máy, Trợ lý AI gợi ý ngay 3 bước xử lý rất sát thực tế.”</w:t>
             </w:r>
           </w:p>
         </w:tc>
@@ -1175,6 +1261,10 @@
         </w:tblCellMar>
       </w:tblPr>
       <w:tr>
+        <w:trPr>
+          <w:cantSplit/>
+          <w:tblHeader/>
+        </w:trPr>
         <w:tc>
           <w:tcPr>
             <w:tcW w:w="2500" w:type="pct"/>
@@ -1215,7 +1305,7 @@
                 <w:b/>
                 <w:color w:val="FFFFFF"/>
               </w:rPr>
-              <w:t xml:space="preserve">TỔ TRƯỞNG CHUYÊN MÔN ICT</w:t>
+              <w:t xml:space="preserve">TÁC GIẢ DỰ THI – TỔ TRƯỞNG CHUYÊN MÔN TỔ ICT</w:t>
             </w:r>
           </w:p>
         </w:tc>
@@ -1263,7 +1353,7 @@
                 <w:szCs w:val="24"/>
               </w:rPr>
               <w:t xml:space="preserve">(Đã ký)
-ThS. Võ Doãn Anh Huy</w:t>
+Thầy Đỗ Anh Huy</w:t>
             </w:r>
           </w:p>
         </w:tc>

</xml_diff>